<commit_message>
feat: Word export improvements — designation from XML, em dash for empty params
- ProjectStore: add DocumentNumber, DocumentTitle, DevelopedBy, CheckedBy, ApprovedBy from XML metadata
- WelcomeViewModel: pass importResult to store.Load
- Form4ViewModel: use DocumentNumber as DocumentDesignation in Word export
- WordService: replace header/footer placeholders directly in ZIP XML (bypasses wne:txbxContent SDK limitation)
- WordService: write em dash for missing parameter values
- ComponentTypeName: always use DetectedCategory from XML, not DB
- WordFormData: rename Designation → TypeName in WordComponentData
- MetaCellKey: rename Designation → ComponentType (componentType)
- map.json: update metaCells key designation → componentType
</commit_message>
<xml_diff>
--- a/src/OperationMaps.Infrastructure/Word/Resources/Form4/template.docx
+++ b/src/OperationMaps.Infrastructure/Word/Resources/Form4/template.docx
@@ -5,7 +5,7 @@
     <w:tbl>
       <w:tblPr>
         <w:tblW w:w="1300.60pt" w:type="dxa"/>
-        <w:tblInd w:w="2pt" w:type="dxa"/>
+        <w:tblInd w:w="0.25pt" w:type="dxa"/>
         <w:tblLayout w:type="fixed"/>
         <w:tblCellMar>
           <w:start w:w="2pt" w:type="dxa"/>
@@ -809,21 +809,12 @@
                 <w:szCs w:val="24"/>
               </w:rPr>
             </w:pPr>
-            <w:proofErr w:type="gramStart"/>
             <w:r>
               <w:rPr>
                 <w:sz w:val="24"/>
                 <w:szCs w:val="24"/>
               </w:rPr>
-              <w:t>Условия  эксплуатации</w:t>
-            </w:r>
-            <w:proofErr w:type="gramEnd"/>
-            <w:r>
-              <w:rPr>
-                <w:sz w:val="24"/>
-                <w:szCs w:val="24"/>
-              </w:rPr>
-              <w:t xml:space="preserve">  в  аппаратуре</w:t>
+              <w:t>Условия эксплуатации в аппаратуре</w:t>
             </w:r>
           </w:p>
         </w:tc>
@@ -1413,17 +1404,8 @@
                 <w:sz w:val="24"/>
                 <w:szCs w:val="24"/>
               </w:rPr>
-              <w:t xml:space="preserve">показатель </w:t>
+              <w:t>показатель сохраняемости, лет</w:t>
             </w:r>
-            <w:proofErr w:type="gramStart"/>
-            <w:r>
-              <w:rPr>
-                <w:sz w:val="24"/>
-                <w:szCs w:val="24"/>
-              </w:rPr>
-              <w:t>сохраняемости,  лет</w:t>
-            </w:r>
-            <w:proofErr w:type="gramEnd"/>
           </w:p>
         </w:tc>
         <w:tc>
@@ -2485,23 +2467,7 @@
                 <w:sz w:val="24"/>
                 <w:szCs w:val="24"/>
               </w:rPr>
-              <w:t xml:space="preserve">давление </w:t>
-            </w:r>
-            <w:proofErr w:type="spellStart"/>
-            <w:r>
-              <w:rPr>
-                <w:sz w:val="24"/>
-                <w:szCs w:val="24"/>
-              </w:rPr>
-              <w:t>окр</w:t>
-            </w:r>
-            <w:proofErr w:type="spellEnd"/>
-            <w:r>
-              <w:rPr>
-                <w:sz w:val="24"/>
-                <w:szCs w:val="24"/>
-              </w:rPr>
-              <w:t>. среды</w:t>
+              <w:t>давление окр. среды</w:t>
             </w:r>
           </w:p>
         </w:tc>
@@ -4595,7 +4561,7 @@
         <w:noProof/>
       </w:rPr>
       <w:drawing>
-        <wp:anchor distT="0" distB="0" distL="114300" distR="114300" simplePos="0" relativeHeight="251667968" behindDoc="0" locked="0" layoutInCell="0" allowOverlap="1" wp14:anchorId="08B2681C" wp14:editId="12329819">
+        <wp:anchor distT="0" distB="0" distL="114300" distR="114300" simplePos="0" relativeHeight="251667968" behindDoc="0" locked="0" layoutInCell="0" allowOverlap="1" wp14:anchorId="07F63EE4" wp14:editId="0CD766A1">
           <wp:simplePos x="0" y="0"/>
           <wp:positionH relativeFrom="column">
             <wp:posOffset>6985</wp:posOffset>
@@ -4717,7 +4683,7 @@
         <w:noProof/>
       </w:rPr>
       <w:drawing>
-        <wp:anchor distT="0" distB="0" distL="114300" distR="114300" simplePos="0" relativeHeight="251661824" behindDoc="1" locked="0" layoutInCell="1" allowOverlap="1" wp14:anchorId="16D1F710" wp14:editId="725B6F0F">
+        <wp:anchor distT="0" distB="0" distL="114300" distR="114300" simplePos="0" relativeHeight="251661824" behindDoc="1" locked="0" layoutInCell="1" allowOverlap="1" wp14:anchorId="67FC51C6" wp14:editId="55DA0B1F">
           <wp:simplePos x="0" y="0"/>
           <wp:positionH relativeFrom="column">
             <wp:posOffset>7519035</wp:posOffset>
@@ -5249,71 +5215,8 @@
                             <w:bCs/>
                             <w:sz w:val="36"/>
                             <w:szCs w:val="36"/>
-                            <w:highlight w:val="yellow"/>
                           </w:rPr>
-                          <w:t>ВЕИР.</w:t>
-                        </w:r>
-                        <w:r>
-                          <w:rPr>
-                            <w:b/>
-                            <w:bCs/>
-                            <w:sz w:val="36"/>
-                            <w:szCs w:val="36"/>
-                            <w:highlight w:val="yellow"/>
-                          </w:rPr>
-                          <w:t>436734</w:t>
-                        </w:r>
-                        <w:r>
-                          <w:rPr>
-                            <w:b/>
-                            <w:bCs/>
-                            <w:sz w:val="36"/>
-                            <w:szCs w:val="36"/>
-                            <w:highlight w:val="yellow"/>
-                          </w:rPr>
-                          <w:t>.</w:t>
-                        </w:r>
-                        <w:r>
-                          <w:rPr>
-                            <w:b/>
-                            <w:bCs/>
-                            <w:sz w:val="36"/>
-                            <w:szCs w:val="36"/>
-                            <w:highlight w:val="yellow"/>
-                            <w:lang w:val="en-US"/>
-                          </w:rPr>
-                          <w:t>7</w:t>
-                        </w:r>
-                        <w:r>
-                          <w:rPr>
-                            <w:b/>
-                            <w:bCs/>
-                            <w:sz w:val="36"/>
-                            <w:szCs w:val="36"/>
-                            <w:highlight w:val="yellow"/>
-                          </w:rPr>
-                          <w:t>2</w:t>
-                        </w:r>
-                        <w:r>
-                          <w:rPr>
-                            <w:b/>
-                            <w:bCs/>
-                            <w:sz w:val="36"/>
-                            <w:szCs w:val="36"/>
-                            <w:highlight w:val="yellow"/>
-                            <w:lang w:val="en-US"/>
-                          </w:rPr>
-                          <w:t>0</w:t>
-                        </w:r>
-                        <w:r>
-                          <w:rPr>
-                            <w:b/>
-                            <w:bCs/>
-                            <w:sz w:val="36"/>
-                            <w:szCs w:val="36"/>
-                            <w:highlight w:val="yellow"/>
-                          </w:rPr>
-                          <w:t>Д4</w:t>
+                          <w:t>{{designation}}</w:t>
                         </w:r>
                       </w:p>
                     </wne:txbxContent>
@@ -6411,7 +6314,7 @@
         <w:noProof/>
       </w:rPr>
       <w:drawing>
-        <wp:anchor distT="0" distB="0" distL="114300" distR="114300" simplePos="0" relativeHeight="251666944" behindDoc="0" locked="0" layoutInCell="0" allowOverlap="1" wp14:anchorId="0FFFCBC0" wp14:editId="7C3015D5">
+        <wp:anchor distT="0" distB="0" distL="114300" distR="114300" simplePos="0" relativeHeight="251666944" behindDoc="0" locked="0" layoutInCell="0" allowOverlap="1" wp14:anchorId="28E97736" wp14:editId="1F8F0904">
           <wp:simplePos x="0" y="0"/>
           <wp:positionH relativeFrom="column">
             <wp:posOffset>-232410</wp:posOffset>
@@ -6494,7 +6397,7 @@
         <w:noProof/>
       </w:rPr>
       <w:drawing>
-        <wp:anchor distT="0" distB="0" distL="114300" distR="114300" simplePos="0" relativeHeight="251665920" behindDoc="0" locked="0" layoutInCell="0" allowOverlap="1" wp14:anchorId="63383B4C" wp14:editId="770CFA04">
+        <wp:anchor distT="0" distB="0" distL="114300" distR="114300" simplePos="0" relativeHeight="251665920" behindDoc="0" locked="0" layoutInCell="0" allowOverlap="1" wp14:anchorId="4D59B359" wp14:editId="05422F75">
           <wp:simplePos x="0" y="0"/>
           <wp:positionH relativeFrom="column">
             <wp:posOffset>-232410</wp:posOffset>
@@ -6577,7 +6480,7 @@
         <w:noProof/>
       </w:rPr>
       <w:drawing>
-        <wp:anchor distT="0" distB="0" distL="114300" distR="114300" simplePos="0" relativeHeight="251664896" behindDoc="0" locked="0" layoutInCell="0" allowOverlap="1" wp14:anchorId="7F47B570" wp14:editId="1330BCE6">
+        <wp:anchor distT="0" distB="0" distL="114300" distR="114300" simplePos="0" relativeHeight="251664896" behindDoc="0" locked="0" layoutInCell="0" allowOverlap="1" wp14:anchorId="572351FA" wp14:editId="010CBFB0">
           <wp:simplePos x="0" y="0"/>
           <wp:positionH relativeFrom="column">
             <wp:posOffset>-232410</wp:posOffset>
@@ -6660,7 +6563,7 @@
         <w:noProof/>
       </w:rPr>
       <w:drawing>
-        <wp:anchor distT="0" distB="0" distL="114300" distR="114300" simplePos="0" relativeHeight="251663872" behindDoc="0" locked="0" layoutInCell="0" allowOverlap="1" wp14:anchorId="7D0879ED" wp14:editId="2CFF409B">
+        <wp:anchor distT="0" distB="0" distL="114300" distR="114300" simplePos="0" relativeHeight="251663872" behindDoc="0" locked="0" layoutInCell="0" allowOverlap="1" wp14:anchorId="61226A93" wp14:editId="005F669E">
           <wp:simplePos x="0" y="0"/>
           <wp:positionH relativeFrom="column">
             <wp:posOffset>-232410</wp:posOffset>
@@ -6743,7 +6646,7 @@
         <w:noProof/>
       </w:rPr>
       <w:drawing>
-        <wp:anchor distT="0" distB="0" distL="114300" distR="114300" simplePos="0" relativeHeight="251662848" behindDoc="0" locked="0" layoutInCell="0" allowOverlap="1" wp14:anchorId="493A7D32" wp14:editId="76318363">
+        <wp:anchor distT="0" distB="0" distL="114300" distR="114300" simplePos="0" relativeHeight="251662848" behindDoc="0" locked="0" layoutInCell="0" allowOverlap="1" wp14:anchorId="66F078D6" wp14:editId="3258A7D9">
           <wp:simplePos x="0" y="0"/>
           <wp:positionH relativeFrom="column">
             <wp:posOffset>-232410</wp:posOffset>
@@ -6826,7 +6729,7 @@
         <w:noProof/>
       </w:rPr>
       <w:drawing>
-        <wp:anchor distT="0" distB="0" distL="114300" distR="114300" simplePos="0" relativeHeight="251658752" behindDoc="0" locked="0" layoutInCell="0" allowOverlap="1" wp14:anchorId="63E1C9FE" wp14:editId="27DE224B">
+        <wp:anchor distT="0" distB="0" distL="114300" distR="114300" simplePos="0" relativeHeight="251658752" behindDoc="0" locked="0" layoutInCell="0" allowOverlap="1" wp14:anchorId="0E2C0C99" wp14:editId="4AEBF81D">
           <wp:simplePos x="0" y="0"/>
           <wp:positionH relativeFrom="column">
             <wp:posOffset>-435610</wp:posOffset>
@@ -6920,7 +6823,7 @@
         <w:noProof/>
       </w:rPr>
       <w:drawing>
-        <wp:anchor distT="0" distB="0" distL="114300" distR="114300" simplePos="0" relativeHeight="251657728" behindDoc="0" locked="0" layoutInCell="0" allowOverlap="1" wp14:anchorId="680F0584" wp14:editId="46C6235B">
+        <wp:anchor distT="0" distB="0" distL="114300" distR="114300" simplePos="0" relativeHeight="251657728" behindDoc="0" locked="0" layoutInCell="0" allowOverlap="1" wp14:anchorId="599A42A8" wp14:editId="0DFC03DF">
           <wp:simplePos x="0" y="0"/>
           <wp:positionH relativeFrom="column">
             <wp:posOffset>-438785</wp:posOffset>
@@ -6989,23 +6892,7 @@
                           <w:b/>
                           <w:bCs/>
                         </w:rPr>
-                        <w:t xml:space="preserve">Инв. № </w:t>
-                      </w:r>
-                      <w:proofErr w:type="spellStart"/>
-                      <w:r>
-                        <w:rPr>
-                          <w:b/>
-                          <w:bCs/>
-                        </w:rPr>
-                        <w:t>дубл</w:t>
-                      </w:r>
-                      <w:proofErr w:type="spellEnd"/>
-                      <w:r>
-                        <w:rPr>
-                          <w:b/>
-                          <w:bCs/>
-                        </w:rPr>
-                        <w:t>.</w:t>
+                        <w:t>Инв. № дубл.</w:t>
                       </w:r>
                     </w:p>
                   </wne:txbxContent>
@@ -7030,7 +6917,7 @@
         <w:noProof/>
       </w:rPr>
       <w:drawing>
-        <wp:anchor distT="0" distB="0" distL="114300" distR="114300" simplePos="0" relativeHeight="251655680" behindDoc="0" locked="0" layoutInCell="0" allowOverlap="1" wp14:anchorId="2353768A" wp14:editId="7B3B6406">
+        <wp:anchor distT="0" distB="0" distL="114300" distR="114300" simplePos="0" relativeHeight="251655680" behindDoc="0" locked="0" layoutInCell="0" allowOverlap="1" wp14:anchorId="182D3783" wp14:editId="19B76A98">
           <wp:simplePos x="0" y="0"/>
           <wp:positionH relativeFrom="column">
             <wp:posOffset>-445135</wp:posOffset>
@@ -7124,7 +7011,7 @@
         <w:noProof/>
       </w:rPr>
       <w:drawing>
-        <wp:anchor distT="0" distB="0" distL="114300" distR="114300" simplePos="0" relativeHeight="251654656" behindDoc="0" locked="0" layoutInCell="0" allowOverlap="1" wp14:anchorId="53F760F3" wp14:editId="4D4074BF">
+        <wp:anchor distT="0" distB="0" distL="114300" distR="114300" simplePos="0" relativeHeight="251654656" behindDoc="0" locked="0" layoutInCell="0" allowOverlap="1" wp14:anchorId="2C810011" wp14:editId="6BEC6484">
           <wp:simplePos x="0" y="0"/>
           <wp:positionH relativeFrom="column">
             <wp:posOffset>-434975</wp:posOffset>
@@ -7223,7 +7110,7 @@
         <w:noProof/>
       </w:rPr>
       <w:drawing>
-        <wp:anchor distT="0" distB="0" distL="114300" distR="114300" simplePos="0" relativeHeight="251653632" behindDoc="0" locked="0" layoutInCell="0" allowOverlap="1" wp14:anchorId="544F3BCB" wp14:editId="1AA22747">
+        <wp:anchor distT="0" distB="0" distL="114300" distR="114300" simplePos="0" relativeHeight="251653632" behindDoc="0" locked="0" layoutInCell="0" allowOverlap="1" wp14:anchorId="66D8FBB6" wp14:editId="2D3D545A">
           <wp:simplePos x="0" y="0"/>
           <wp:positionH relativeFrom="column">
             <wp:posOffset>-445770</wp:posOffset>
@@ -7287,7 +7174,7 @@
         <w:noProof/>
       </w:rPr>
       <w:drawing>
-        <wp:anchor distT="0" distB="0" distL="114300" distR="114300" simplePos="0" relativeHeight="251650560" behindDoc="0" locked="0" layoutInCell="0" allowOverlap="1" wp14:anchorId="7EB5BBB3" wp14:editId="5B776E52">
+        <wp:anchor distT="0" distB="0" distL="114300" distR="114300" simplePos="0" relativeHeight="251650560" behindDoc="0" locked="0" layoutInCell="0" allowOverlap="1" wp14:anchorId="24D9D55E" wp14:editId="53DB345D">
           <wp:simplePos x="0" y="0"/>
           <wp:positionH relativeFrom="column">
             <wp:posOffset>-267970</wp:posOffset>
@@ -7351,7 +7238,7 @@
         <w:noProof/>
       </w:rPr>
       <w:drawing>
-        <wp:anchor distT="0" distB="0" distL="114300" distR="114300" simplePos="0" relativeHeight="251648512" behindDoc="0" locked="0" layoutInCell="0" allowOverlap="1" wp14:anchorId="1CEEC3E1" wp14:editId="3574D28B">
+        <wp:anchor distT="0" distB="0" distL="114300" distR="114300" simplePos="0" relativeHeight="251648512" behindDoc="0" locked="0" layoutInCell="0" allowOverlap="1" wp14:anchorId="1B74BCFD" wp14:editId="6882EA48">
           <wp:simplePos x="0" y="0"/>
           <wp:positionH relativeFrom="column">
             <wp:posOffset>-448310</wp:posOffset>
@@ -7419,7 +7306,7 @@
         <w:noProof/>
       </w:rPr>
       <w:drawing>
-        <wp:anchor distT="0" distB="0" distL="114300" distR="114300" simplePos="0" relativeHeight="251660800" behindDoc="0" locked="0" layoutInCell="0" allowOverlap="1" wp14:anchorId="0EDD6057" wp14:editId="03E359EB">
+        <wp:anchor distT="0" distB="0" distL="114300" distR="114300" simplePos="0" relativeHeight="251660800" behindDoc="0" locked="0" layoutInCell="0" allowOverlap="1" wp14:anchorId="0162CB17" wp14:editId="4615D94B">
           <wp:simplePos x="0" y="0"/>
           <wp:positionH relativeFrom="column">
             <wp:posOffset>12572365</wp:posOffset>
@@ -7488,17 +7375,8 @@
                           <w:b/>
                           <w:bCs/>
                         </w:rPr>
-                        <w:t xml:space="preserve">Формат А3 </w:t>
+                        <w:t>Формат А3 А3</w:t>
                       </w:r>
-                      <w:proofErr w:type="spellStart"/>
-                      <w:r>
-                        <w:rPr>
-                          <w:b/>
-                          <w:bCs/>
-                        </w:rPr>
-                        <w:t>А3</w:t>
-                      </w:r>
-                      <w:proofErr w:type="spellEnd"/>
                       <w:r>
                         <w:rPr>
                           <w:b/>
@@ -7506,7 +7384,7 @@
                           <w:noProof/>
                         </w:rPr>
                         <w:drawing>
-                          <wp:inline distT="0" distB="0" distL="0" distR="0" wp14:anchorId="53BBFD53" wp14:editId="696FE809">
+                          <wp:inline distT="0" distB="0" distL="0" distR="0" wp14:anchorId="690C8E2F" wp14:editId="21B7822F">
                             <wp:extent cx="1638300" cy="57150"/>
                             <wp:effectExtent l="0" t="0" r="0" b="0"/>
                             <wp:docPr id="56" name="Picture 1"/>
@@ -7577,7 +7455,7 @@
         <w:noProof/>
       </w:rPr>
       <w:drawing>
-        <wp:anchor distT="0" distB="0" distL="114300" distR="114300" simplePos="0" relativeHeight="251659776" behindDoc="0" locked="0" layoutInCell="0" allowOverlap="1" wp14:anchorId="5DC595A9" wp14:editId="13F019ED">
+        <wp:anchor distT="0" distB="0" distL="114300" distR="114300" simplePos="0" relativeHeight="251659776" behindDoc="0" locked="0" layoutInCell="0" allowOverlap="1" wp14:anchorId="4F3DE4F8" wp14:editId="1485D16B">
           <wp:simplePos x="0" y="0"/>
           <wp:positionH relativeFrom="column">
             <wp:posOffset>-450850</wp:posOffset>
@@ -7641,7 +7519,7 @@
         <w:noProof/>
       </w:rPr>
       <w:drawing>
-        <wp:anchor distT="0" distB="0" distL="114300" distR="114300" simplePos="0" relativeHeight="251656704" behindDoc="0" locked="0" layoutInCell="0" allowOverlap="1" wp14:anchorId="000B6D1C" wp14:editId="788F5D6B">
+        <wp:anchor distT="0" distB="0" distL="114300" distR="114300" simplePos="0" relativeHeight="251656704" behindDoc="0" locked="0" layoutInCell="0" allowOverlap="1" wp14:anchorId="6CBFA8BF" wp14:editId="0FB98E0B">
           <wp:simplePos x="0" y="0"/>
           <wp:positionH relativeFrom="column">
             <wp:posOffset>-448310</wp:posOffset>
@@ -7705,21 +7583,12 @@
                           <w:bCs/>
                         </w:rPr>
                       </w:pPr>
-                      <w:proofErr w:type="spellStart"/>
                       <w:r>
                         <w:rPr>
                           <w:b/>
                           <w:bCs/>
                         </w:rPr>
-                        <w:t>Взам</w:t>
-                      </w:r>
-                      <w:proofErr w:type="spellEnd"/>
-                      <w:r>
-                        <w:rPr>
-                          <w:b/>
-                          <w:bCs/>
-                        </w:rPr>
-                        <w:t>. инв.№</w:t>
+                        <w:t>Взам. инв.№</w:t>
                       </w:r>
                     </w:p>
                   </wne:txbxContent>
@@ -7744,7 +7613,7 @@
         <w:noProof/>
       </w:rPr>
       <w:drawing>
-        <wp:anchor distT="0" distB="0" distL="114300" distR="114300" simplePos="0" relativeHeight="251652608" behindDoc="0" locked="0" layoutInCell="0" allowOverlap="1" wp14:anchorId="51657030" wp14:editId="3870EF2F">
+        <wp:anchor distT="0" distB="0" distL="114300" distR="114300" simplePos="0" relativeHeight="251652608" behindDoc="0" locked="0" layoutInCell="0" allowOverlap="1" wp14:anchorId="5C8AE9C7" wp14:editId="58375075">
           <wp:simplePos x="0" y="0"/>
           <wp:positionH relativeFrom="column">
             <wp:posOffset>-430530</wp:posOffset>
@@ -7808,7 +7677,7 @@
         <w:noProof/>
       </w:rPr>
       <w:drawing>
-        <wp:anchor distT="0" distB="0" distL="114300" distR="114300" simplePos="0" relativeHeight="251651584" behindDoc="0" locked="0" layoutInCell="0" allowOverlap="1" wp14:anchorId="3B8DB0F0" wp14:editId="361CBF52">
+        <wp:anchor distT="0" distB="0" distL="114300" distR="114300" simplePos="0" relativeHeight="251651584" behindDoc="0" locked="0" layoutInCell="0" allowOverlap="1" wp14:anchorId="5D167830" wp14:editId="420DA18E">
           <wp:simplePos x="0" y="0"/>
           <wp:positionH relativeFrom="column">
             <wp:posOffset>-450850</wp:posOffset>
@@ -7872,7 +7741,7 @@
         <w:noProof/>
       </w:rPr>
       <w:drawing>
-        <wp:anchor distT="0" distB="0" distL="114300" distR="114300" simplePos="0" relativeHeight="251649536" behindDoc="0" locked="0" layoutInCell="0" allowOverlap="1" wp14:anchorId="45C9C3F3" wp14:editId="1318D2ED">
+        <wp:anchor distT="0" distB="0" distL="114300" distR="114300" simplePos="0" relativeHeight="251649536" behindDoc="0" locked="0" layoutInCell="0" allowOverlap="1" wp14:anchorId="1FFB8F71" wp14:editId="10BAA723">
           <wp:simplePos x="0" y="0"/>
           <wp:positionH relativeFrom="column">
             <wp:posOffset>-439420</wp:posOffset>
@@ -7936,7 +7805,7 @@
         <w:noProof/>
       </w:rPr>
       <w:drawing>
-        <wp:anchor distT="0" distB="0" distL="114300" distR="114300" simplePos="0" relativeHeight="251647488" behindDoc="0" locked="0" layoutInCell="0" allowOverlap="1" wp14:anchorId="686F162B" wp14:editId="75E0345E">
+        <wp:anchor distT="0" distB="0" distL="114300" distR="114300" simplePos="0" relativeHeight="251647488" behindDoc="0" locked="0" layoutInCell="0" allowOverlap="1" wp14:anchorId="63AAAF52" wp14:editId="2614D32D">
           <wp:simplePos x="0" y="0"/>
           <wp:positionH relativeFrom="column">
             <wp:posOffset>-1270</wp:posOffset>

</xml_diff>